<commit_message>
Update README to show new demonstration folder
</commit_message>
<xml_diff>
--- a/docs/notes.docx
+++ b/docs/notes.docx
@@ -120,8 +120,13 @@
         </w:r>
       </w:hyperlink>
       <w:r>
-        <w:t xml:space="preserve"> - icons as svgs</w:t>
-      </w:r>
+        <w:t xml:space="preserve"> - icons as </w:t>
+      </w:r>
+      <w:proofErr w:type="spellStart"/>
+      <w:r>
+        <w:t>svgs</w:t>
+      </w:r>
+      <w:proofErr w:type="spellEnd"/>
     </w:p>
     <w:p>
       <w:hyperlink r:id="rId5" w:history="1">
@@ -136,8 +141,13 @@
         <w:t xml:space="preserve"> - logo</w:t>
       </w:r>
       <w:r>
-        <w:t xml:space="preserve"> as an svg</w:t>
-      </w:r>
+        <w:t xml:space="preserve"> as an </w:t>
+      </w:r>
+      <w:proofErr w:type="spellStart"/>
+      <w:r>
+        <w:t>svg</w:t>
+      </w:r>
+      <w:proofErr w:type="spellEnd"/>
     </w:p>
     <w:p>
       <w:hyperlink r:id="rId6" w:history="1">
@@ -149,7 +159,15 @@
         </w:r>
       </w:hyperlink>
       <w:r>
-        <w:t xml:space="preserve"> - html, css and python help</w:t>
+        <w:t xml:space="preserve"> - html, </w:t>
+      </w:r>
+      <w:proofErr w:type="spellStart"/>
+      <w:r>
+        <w:t>css</w:t>
+      </w:r>
+      <w:proofErr w:type="spellEnd"/>
+      <w:r>
+        <w:t xml:space="preserve"> and python help</w:t>
       </w:r>
     </w:p>
     <w:p>
@@ -173,12 +191,30 @@
         <w:t>google dev tools</w:t>
       </w:r>
       <w:r>
-        <w:t>, flask debug, pytest - debugging</w:t>
-      </w:r>
-    </w:p>
-    <w:p>
-      <w:r>
-        <w:t xml:space="preserve">github, google forms </w:t>
+        <w:t xml:space="preserve">, flask debug, </w:t>
+      </w:r>
+      <w:proofErr w:type="spellStart"/>
+      <w:r>
+        <w:t>pytest</w:t>
+      </w:r>
+      <w:proofErr w:type="spellEnd"/>
+      <w:r>
+        <w:t xml:space="preserve"> - debugging</w:t>
+      </w:r>
+    </w:p>
+    <w:p>
+      <w:proofErr w:type="spellStart"/>
+      <w:r>
+        <w:t>github</w:t>
+      </w:r>
+      <w:proofErr w:type="spellEnd"/>
+      <w:r>
+        <w:t xml:space="preserve">, google forms </w:t>
+      </w:r>
+    </w:p>
+    <w:p>
+      <w:r>
+        <w:t>[w3schools validator ?]</w:t>
       </w:r>
     </w:p>
     <w:p/>
@@ -275,8 +311,13 @@
         <w:t>–</w:t>
       </w:r>
       <w:r>
-        <w:t xml:space="preserve"> css</w:t>
-      </w:r>
+        <w:t xml:space="preserve"> </w:t>
+      </w:r>
+      <w:proofErr w:type="spellStart"/>
+      <w:r>
+        <w:t>css</w:t>
+      </w:r>
+      <w:proofErr w:type="spellEnd"/>
     </w:p>
     <w:p/>
     <w:sectPr>

</xml_diff>